<commit_message>
build windows installer beta
</commit_message>
<xml_diff>
--- a/SPT Setwan.docx
+++ b/SPT Setwan.docx
@@ -631,6 +631,14 @@
           <w:lang w:val="en-US"/>
         </w:rPr>
         <w:tab/>
+      </w:r>
+      <w:r>
+        <w:rPr>
+          <w:rFonts w:hint="default" w:ascii="Arial" w:hAnsi="Arial" w:cs="Arial"/>
+          <w:sz w:val="22"/>
+          <w:szCs w:val="22"/>
+          <w:lang w:val="en-US"/>
+        </w:rPr>
         <w:t>:</w:t>
       </w:r>
     </w:p>
@@ -1222,12 +1230,12 @@
         <w:adjustRightInd w:val="0"/>
         <w:jc w:val="both"/>
         <w:rPr>
-          <w:rFonts w:ascii="Arial" w:hAnsi="Arial" w:cs="Arial"/>
+          <w:rFonts w:hint="default" w:ascii="Arial" w:hAnsi="Arial" w:cs="Arial"/>
           <w:bCs/>
           <w:sz w:val="22"/>
           <w:szCs w:val="22"/>
           <w:u w:val="single"/>
-          <w:lang w:val="id-ID"/>
+          <w:lang w:val="en-US"/>
         </w:rPr>
       </w:pPr>
       <w:r>
@@ -1242,14 +1250,14 @@
       </w:r>
       <w:r>
         <w:rPr>
-          <w:rFonts w:ascii="Arial" w:hAnsi="Arial" w:cs="Arial"/>
+          <w:rFonts w:hint="default" w:ascii="Arial" w:hAnsi="Arial" w:cs="Arial"/>
           <w:bCs/>
           <w:sz w:val="22"/>
           <w:szCs w:val="22"/>
           <w:u w:val="single"/>
-          <w:lang w:val="id-ID"/>
-        </w:rPr>
-        <w:t>DANCE ISHAK PALIT, M. Si</w:t>
+          <w:lang w:val="en-US"/>
+        </w:rPr>
+        <w:t>{ketuadprd}</w:t>
       </w:r>
     </w:p>
     <w:p>
@@ -1644,7 +1652,7 @@
         <w:ind w:left="7200"/>
         <w:jc w:val="both"/>
         <w:rPr>
-          <w:rFonts w:hint="default" w:ascii="Arial" w:hAnsi="Arial" w:cs="Arial"/>
+          <w:rFonts w:hint="default" w:ascii="Times New Roman" w:hAnsi="Times New Roman" w:cs="Times New Roman"/>
           <w:sz w:val="22"/>
           <w:szCs w:val="22"/>
           <w:lang w:val="en-US"/>
@@ -1652,7 +1660,7 @@
       </w:pPr>
       <w:r>
         <w:rPr>
-          <w:rFonts w:ascii="Arial" w:hAnsi="Arial" w:cs="Arial"/>
+          <w:rFonts w:hint="default" w:ascii="Times New Roman" w:hAnsi="Times New Roman" w:cs="Times New Roman"/>
           <w:sz w:val="22"/>
           <w:szCs w:val="22"/>
           <w:lang w:val="id-ID"/>
@@ -1661,7 +1669,7 @@
       </w:r>
       <w:r>
         <w:rPr>
-          <w:rFonts w:hint="default" w:ascii="Arial" w:hAnsi="Arial" w:cs="Arial"/>
+          <w:rFonts w:hint="default" w:ascii="Times New Roman" w:hAnsi="Times New Roman" w:cs="Times New Roman"/>
           <w:sz w:val="22"/>
           <w:szCs w:val="22"/>
           <w:lang w:val="en-US"/>
@@ -1677,7 +1685,7 @@
         <w:spacing w:line="360" w:lineRule="auto"/>
         <w:jc w:val="both"/>
         <w:rPr>
-          <w:rFonts w:ascii="Arial" w:hAnsi="Arial" w:cs="Arial"/>
+          <w:rFonts w:hint="default" w:ascii="Times New Roman" w:hAnsi="Times New Roman" w:cs="Times New Roman"/>
           <w:sz w:val="22"/>
           <w:szCs w:val="22"/>
           <w:lang w:val="sv-FI"/>
@@ -1706,9 +1714,9 @@
         </w:tblCellMar>
       </w:tblPr>
       <w:tblGrid>
-        <w:gridCol w:w="1818"/>
-        <w:gridCol w:w="4997"/>
-        <w:gridCol w:w="3675"/>
+        <w:gridCol w:w="1702"/>
+        <w:gridCol w:w="5089"/>
+        <w:gridCol w:w="3699"/>
       </w:tblGrid>
       <w:tr>
         <w:tblPrEx>
@@ -1739,15 +1747,15 @@
               <w:spacing w:line="360" w:lineRule="auto"/>
               <w:jc w:val="both"/>
               <w:rPr>
-                <w:rFonts w:ascii="Arial" w:hAnsi="Arial" w:cs="Arial"/>
-                <w:sz w:val="22"/>
-                <w:szCs w:val="22"/>
-                <w:lang w:val="id-ID"/>
-              </w:rPr>
-            </w:pPr>
-            <w:r>
-              <w:rPr>
-                <w:rFonts w:ascii="Arial" w:hAnsi="Arial" w:cs="Arial"/>
+                <w:rFonts w:hint="default" w:ascii="Times New Roman" w:hAnsi="Times New Roman" w:cs="Times New Roman"/>
+                <w:sz w:val="22"/>
+                <w:szCs w:val="22"/>
+                <w:lang w:val="id-ID"/>
+              </w:rPr>
+            </w:pPr>
+            <w:r>
+              <w:rPr>
+                <w:rFonts w:hint="default" w:ascii="Times New Roman" w:hAnsi="Times New Roman" w:cs="Times New Roman"/>
                 <w:sz w:val="22"/>
                 <w:szCs w:val="22"/>
                 <w:lang w:val="id-ID"/>
@@ -1768,7 +1776,7 @@
               <w:spacing w:line="360" w:lineRule="auto"/>
               <w:jc w:val="both"/>
               <w:rPr>
-                <w:rFonts w:hint="default" w:ascii="Arial" w:hAnsi="Arial" w:cs="Arial"/>
+                <w:rFonts w:hint="default" w:ascii="Times New Roman" w:hAnsi="Times New Roman" w:cs="Times New Roman"/>
                 <w:sz w:val="22"/>
                 <w:szCs w:val="22"/>
                 <w:lang w:val="en-US"/>
@@ -1776,12 +1784,12 @@
             </w:pPr>
             <w:r>
               <w:rPr>
-                <w:rFonts w:hint="default" w:ascii="Arial" w:hAnsi="Arial" w:cs="Arial"/>
+                <w:rFonts w:hint="default" w:ascii="Times New Roman" w:hAnsi="Times New Roman" w:cs="Times New Roman"/>
                 <w:sz w:val="22"/>
                 <w:szCs w:val="22"/>
                 <w:lang w:val="en-US"/>
               </w:rPr>
-              <w:t>{nomor_surat}</w:t>
+              <w:t>{nomor_surat_spt}</w:t>
             </w:r>
           </w:p>
         </w:tc>
@@ -1797,15 +1805,15 @@
               <w:spacing w:line="360" w:lineRule="auto"/>
               <w:jc w:val="both"/>
               <w:rPr>
-                <w:rFonts w:ascii="Arial" w:hAnsi="Arial" w:cs="Arial"/>
-                <w:sz w:val="22"/>
-                <w:szCs w:val="22"/>
-                <w:lang w:val="id-ID"/>
-              </w:rPr>
-            </w:pPr>
-            <w:r>
-              <w:rPr>
-                <w:rFonts w:ascii="Arial" w:hAnsi="Arial" w:cs="Arial"/>
+                <w:rFonts w:hint="default" w:ascii="Times New Roman" w:hAnsi="Times New Roman" w:cs="Times New Roman"/>
+                <w:sz w:val="22"/>
+                <w:szCs w:val="22"/>
+                <w:lang w:val="id-ID"/>
+              </w:rPr>
+            </w:pPr>
+            <w:r>
+              <w:rPr>
+                <w:rFonts w:hint="default" w:ascii="Times New Roman" w:hAnsi="Times New Roman" w:cs="Times New Roman"/>
                 <w:sz w:val="22"/>
                 <w:szCs w:val="22"/>
                 <w:lang w:val="id-ID"/>
@@ -1844,15 +1852,15 @@
               <w:spacing w:line="360" w:lineRule="auto"/>
               <w:jc w:val="both"/>
               <w:rPr>
-                <w:rFonts w:ascii="Arial" w:hAnsi="Arial" w:cs="Arial"/>
-                <w:sz w:val="22"/>
-                <w:szCs w:val="22"/>
-                <w:lang w:val="id-ID"/>
-              </w:rPr>
-            </w:pPr>
-            <w:r>
-              <w:rPr>
-                <w:rFonts w:ascii="Arial" w:hAnsi="Arial" w:cs="Arial"/>
+                <w:rFonts w:hint="default" w:ascii="Times New Roman" w:hAnsi="Times New Roman" w:cs="Times New Roman"/>
+                <w:sz w:val="22"/>
+                <w:szCs w:val="22"/>
+                <w:lang w:val="id-ID"/>
+              </w:rPr>
+            </w:pPr>
+            <w:r>
+              <w:rPr>
+                <w:rFonts w:hint="default" w:ascii="Times New Roman" w:hAnsi="Times New Roman" w:cs="Times New Roman"/>
                 <w:sz w:val="22"/>
                 <w:szCs w:val="22"/>
                 <w:lang w:val="id-ID"/>
@@ -1873,15 +1881,15 @@
               <w:spacing w:line="360" w:lineRule="auto"/>
               <w:jc w:val="both"/>
               <w:rPr>
-                <w:rFonts w:ascii="Arial" w:hAnsi="Arial" w:cs="Arial"/>
-                <w:sz w:val="22"/>
-                <w:szCs w:val="22"/>
-                <w:lang w:val="id-ID"/>
-              </w:rPr>
-            </w:pPr>
-            <w:r>
-              <w:rPr>
-                <w:rFonts w:ascii="Arial" w:hAnsi="Arial" w:cs="Arial"/>
+                <w:rFonts w:hint="default" w:ascii="Times New Roman" w:hAnsi="Times New Roman" w:cs="Times New Roman"/>
+                <w:sz w:val="22"/>
+                <w:szCs w:val="22"/>
+                <w:lang w:val="id-ID"/>
+              </w:rPr>
+            </w:pPr>
+            <w:r>
+              <w:rPr>
+                <w:rFonts w:hint="default" w:ascii="Times New Roman" w:hAnsi="Times New Roman" w:cs="Times New Roman"/>
                 <w:sz w:val="22"/>
                 <w:szCs w:val="22"/>
                 <w:lang w:val="id-ID"/>
@@ -1902,20 +1910,20 @@
               <w:spacing w:line="360" w:lineRule="auto"/>
               <w:jc w:val="both"/>
               <w:rPr>
-                <w:rFonts w:ascii="Arial" w:hAnsi="Arial" w:cs="Arial"/>
-                <w:sz w:val="22"/>
-                <w:szCs w:val="22"/>
-                <w:lang w:val="id-ID"/>
-              </w:rPr>
-            </w:pPr>
-            <w:r>
-              <w:rPr>
-                <w:rFonts w:ascii="Arial" w:hAnsi="Arial" w:cs="Arial"/>
-                <w:sz w:val="22"/>
-                <w:szCs w:val="22"/>
-                <w:lang w:val="id-ID"/>
-              </w:rPr>
-              <w:t>Yth.     Ketua DPRD Kabupaten</w:t>
+                <w:rFonts w:hint="default" w:ascii="Times New Roman" w:hAnsi="Times New Roman" w:cs="Times New Roman"/>
+                <w:sz w:val="22"/>
+                <w:szCs w:val="22"/>
+                <w:lang w:val="id-ID"/>
+              </w:rPr>
+            </w:pPr>
+            <w:r>
+              <w:rPr>
+                <w:rFonts w:hint="default" w:ascii="Times New Roman" w:hAnsi="Times New Roman" w:cs="Times New Roman"/>
+                <w:sz w:val="22"/>
+                <w:szCs w:val="22"/>
+                <w:lang w:val="id-ID"/>
+              </w:rPr>
+              <w:t xml:space="preserve">Yth.     Ketua DPRD </w:t>
             </w:r>
           </w:p>
           <w:p>
@@ -1926,7 +1934,7 @@
               <w:spacing w:line="360" w:lineRule="auto"/>
               <w:jc w:val="both"/>
               <w:rPr>
-                <w:rFonts w:hint="default" w:ascii="Arial" w:hAnsi="Arial" w:cs="Arial"/>
+                <w:rFonts w:hint="default" w:ascii="Times New Roman" w:hAnsi="Times New Roman" w:cs="Times New Roman"/>
                 <w:sz w:val="22"/>
                 <w:szCs w:val="22"/>
                 <w:lang w:val="en-US"/>
@@ -1934,7 +1942,7 @@
             </w:pPr>
             <w:r>
               <w:rPr>
-                <w:rFonts w:ascii="Arial" w:hAnsi="Arial" w:cs="Arial"/>
+                <w:rFonts w:hint="default" w:ascii="Times New Roman" w:hAnsi="Times New Roman" w:cs="Times New Roman"/>
                 <w:sz w:val="22"/>
                 <w:szCs w:val="22"/>
                 <w:lang w:val="id-ID"/>
@@ -1943,7 +1951,7 @@
             </w:r>
             <w:r>
               <w:rPr>
-                <w:rFonts w:hint="default" w:ascii="Arial" w:hAnsi="Arial" w:cs="Arial"/>
+                <w:rFonts w:hint="default" w:ascii="Times New Roman" w:hAnsi="Times New Roman" w:cs="Times New Roman"/>
                 <w:sz w:val="22"/>
                 <w:szCs w:val="22"/>
                 <w:lang w:val="en-US"/>
@@ -1982,15 +1990,15 @@
               <w:spacing w:line="360" w:lineRule="auto"/>
               <w:jc w:val="both"/>
               <w:rPr>
-                <w:rFonts w:ascii="Arial" w:hAnsi="Arial" w:cs="Arial"/>
-                <w:sz w:val="22"/>
-                <w:szCs w:val="22"/>
-                <w:lang w:val="id-ID"/>
-              </w:rPr>
-            </w:pPr>
-            <w:r>
-              <w:rPr>
-                <w:rFonts w:ascii="Arial" w:hAnsi="Arial" w:cs="Arial"/>
+                <w:rFonts w:hint="default" w:ascii="Times New Roman" w:hAnsi="Times New Roman" w:cs="Times New Roman"/>
+                <w:sz w:val="22"/>
+                <w:szCs w:val="22"/>
+                <w:lang w:val="id-ID"/>
+              </w:rPr>
+            </w:pPr>
+            <w:r>
+              <w:rPr>
+                <w:rFonts w:hint="default" w:ascii="Times New Roman" w:hAnsi="Times New Roman" w:cs="Times New Roman"/>
                 <w:sz w:val="22"/>
                 <w:szCs w:val="22"/>
                 <w:lang w:val="id-ID"/>
@@ -2011,7 +2019,7 @@
               <w:spacing w:line="360" w:lineRule="auto"/>
               <w:jc w:val="both"/>
               <w:rPr>
-                <w:rFonts w:ascii="Arial" w:hAnsi="Arial" w:cs="Arial"/>
+                <w:rFonts w:hint="default" w:ascii="Times New Roman" w:hAnsi="Times New Roman" w:cs="Times New Roman"/>
                 <w:b/>
                 <w:sz w:val="22"/>
                 <w:szCs w:val="22"/>
@@ -2020,7 +2028,7 @@
             </w:pPr>
             <w:r>
               <w:rPr>
-                <w:rFonts w:ascii="Arial" w:hAnsi="Arial" w:cs="Arial"/>
+                <w:rFonts w:hint="default" w:ascii="Times New Roman" w:hAnsi="Times New Roman" w:cs="Times New Roman"/>
                 <w:b/>
                 <w:sz w:val="22"/>
                 <w:szCs w:val="22"/>
@@ -2037,7 +2045,7 @@
               <w:spacing w:line="360" w:lineRule="auto"/>
               <w:jc w:val="both"/>
               <w:rPr>
-                <w:rFonts w:ascii="Arial" w:hAnsi="Arial" w:cs="Arial"/>
+                <w:rFonts w:hint="default" w:ascii="Times New Roman" w:hAnsi="Times New Roman" w:cs="Times New Roman"/>
                 <w:b/>
                 <w:sz w:val="22"/>
                 <w:szCs w:val="22"/>
@@ -2046,7 +2054,7 @@
             </w:pPr>
             <w:r>
               <w:rPr>
-                <w:rFonts w:ascii="Arial" w:hAnsi="Arial" w:cs="Arial"/>
+                <w:rFonts w:hint="default" w:ascii="Times New Roman" w:hAnsi="Times New Roman" w:cs="Times New Roman"/>
                 <w:b/>
                 <w:sz w:val="22"/>
                 <w:szCs w:val="22"/>
@@ -2069,7 +2077,7 @@
               <w:ind w:left="660" w:hanging="660" w:hangingChars="300"/>
               <w:jc w:val="both"/>
               <w:rPr>
-                <w:rFonts w:hint="default" w:ascii="Arial" w:hAnsi="Arial" w:cs="Arial"/>
+                <w:rFonts w:hint="default" w:ascii="Times New Roman" w:hAnsi="Times New Roman" w:cs="Times New Roman"/>
                 <w:b/>
                 <w:sz w:val="22"/>
                 <w:szCs w:val="22"/>
@@ -2079,7 +2087,7 @@
             </w:pPr>
             <w:r>
               <w:rPr>
-                <w:rFonts w:ascii="Arial" w:hAnsi="Arial" w:cs="Arial"/>
+                <w:rFonts w:hint="default" w:ascii="Times New Roman" w:hAnsi="Times New Roman" w:cs="Times New Roman"/>
                 <w:sz w:val="22"/>
                 <w:szCs w:val="22"/>
                 <w:lang w:val="id-ID"/>
@@ -2088,7 +2096,7 @@
             </w:r>
             <w:r>
               <w:rPr>
-                <w:rFonts w:hint="default" w:ascii="Arial" w:hAnsi="Arial" w:cs="Arial"/>
+                <w:rFonts w:hint="default" w:ascii="Times New Roman" w:hAnsi="Times New Roman" w:cs="Times New Roman"/>
                 <w:b/>
                 <w:sz w:val="22"/>
                 <w:szCs w:val="22"/>
@@ -2109,7 +2117,7 @@
         <w:spacing w:line="360" w:lineRule="auto"/>
         <w:jc w:val="both"/>
         <w:rPr>
-          <w:rFonts w:ascii="Arial" w:hAnsi="Arial" w:cs="Arial"/>
+          <w:rFonts w:hint="default" w:ascii="Times New Roman" w:hAnsi="Times New Roman" w:cs="Times New Roman"/>
           <w:b/>
           <w:sz w:val="22"/>
           <w:szCs w:val="22"/>
@@ -2172,33 +2180,33 @@
               <w:ind w:left="-37" w:right="-57" w:hanging="246"/>
               <w:jc w:val="both"/>
               <w:rPr>
-                <w:rFonts w:ascii="Arial" w:hAnsi="Arial" w:cs="Arial"/>
-                <w:sz w:val="22"/>
-                <w:szCs w:val="22"/>
-                <w:lang w:val="id-ID"/>
-              </w:rPr>
-            </w:pPr>
-            <w:r>
-              <w:rPr>
-                <w:rFonts w:ascii="Arial" w:hAnsi="Arial" w:cs="Arial"/>
-                <w:sz w:val="22"/>
-                <w:szCs w:val="22"/>
-                <w:lang w:val="id-ID"/>
-              </w:rPr>
-              <w:t xml:space="preserve">           Berdasarkan Hasil Rapat Badan Musyawarah DPRD Kota Salatiga tanggal </w:t>
-            </w:r>
-            <w:r>
-              <w:rPr>
-                <w:rFonts w:hint="default" w:ascii="Arial" w:hAnsi="Arial" w:cs="Arial"/>
+                <w:rFonts w:hint="default" w:ascii="Times New Roman" w:hAnsi="Times New Roman" w:cs="Times New Roman"/>
+                <w:sz w:val="22"/>
+                <w:szCs w:val="22"/>
+                <w:lang w:val="id-ID"/>
+              </w:rPr>
+            </w:pPr>
+            <w:r>
+              <w:rPr>
+                <w:rFonts w:hint="default" w:ascii="Times New Roman" w:hAnsi="Times New Roman" w:cs="Times New Roman"/>
+                <w:sz w:val="22"/>
+                <w:szCs w:val="22"/>
+                <w:lang w:val="id-ID"/>
+              </w:rPr>
+              <w:t xml:space="preserve">           Berdasarkan </w:t>
+            </w:r>
+            <w:r>
+              <w:rPr>
+                <w:rFonts w:hint="default" w:ascii="Times New Roman" w:hAnsi="Times New Roman" w:cs="Times New Roman"/>
                 <w:sz w:val="22"/>
                 <w:szCs w:val="22"/>
                 <w:lang w:val="en-US"/>
               </w:rPr>
-              <w:t>{tanggalrapat}</w:t>
-            </w:r>
-            <w:r>
-              <w:rPr>
-                <w:rFonts w:ascii="Arial" w:hAnsi="Arial" w:cs="Arial"/>
+              <w:t>{dasar}</w:t>
+            </w:r>
+            <w:r>
+              <w:rPr>
+                <w:rFonts w:hint="default" w:ascii="Times New Roman" w:hAnsi="Times New Roman" w:cs="Times New Roman"/>
                 <w:sz w:val="22"/>
                 <w:szCs w:val="22"/>
                 <w:lang w:val="id-ID"/>
@@ -2207,16 +2215,27 @@
             </w:r>
             <w:r>
               <w:rPr>
-                <w:rFonts w:hint="default" w:ascii="Arial" w:hAnsi="Arial" w:cs="Arial"/>
+                <w:rFonts w:hint="default" w:ascii="Times New Roman" w:hAnsi="Times New Roman" w:cs="Times New Roman"/>
                 <w:sz w:val="22"/>
                 <w:szCs w:val="22"/>
                 <w:lang w:val="en-US"/>
               </w:rPr>
-              <w:t>{tentang}</w:t>
-            </w:r>
-            <w:r>
-              <w:rPr>
-                <w:rFonts w:ascii="Arial" w:hAnsi="Arial" w:cs="Arial"/>
+              <w:t>{tentang</w:t>
+            </w:r>
+            <w:bookmarkStart w:id="0" w:name="_GoBack"/>
+            <w:bookmarkEnd w:id="0"/>
+            <w:r>
+              <w:rPr>
+                <w:rFonts w:hint="default" w:ascii="Times New Roman" w:hAnsi="Times New Roman" w:cs="Times New Roman"/>
+                <w:sz w:val="22"/>
+                <w:szCs w:val="22"/>
+                <w:lang w:val="en-US"/>
+              </w:rPr>
+              <w:t>}</w:t>
+            </w:r>
+            <w:r>
+              <w:rPr>
+                <w:rFonts w:hint="default" w:ascii="Times New Roman" w:hAnsi="Times New Roman" w:cs="Times New Roman"/>
                 <w:sz w:val="22"/>
                 <w:szCs w:val="22"/>
                 <w:lang w:val="id-ID"/>
@@ -2225,7 +2244,7 @@
             </w:r>
             <w:r>
               <w:rPr>
-                <w:rFonts w:hint="default" w:ascii="Arial" w:hAnsi="Arial" w:cs="Arial"/>
+                <w:rFonts w:hint="default" w:ascii="Times New Roman" w:hAnsi="Times New Roman" w:cs="Times New Roman"/>
                 <w:sz w:val="22"/>
                 <w:szCs w:val="22"/>
                 <w:lang w:val="en-US"/>
@@ -2234,79 +2253,61 @@
             </w:r>
             <w:r>
               <w:rPr>
-                <w:rFonts w:ascii="Arial" w:hAnsi="Arial" w:cs="Arial"/>
-                <w:sz w:val="22"/>
-                <w:szCs w:val="22"/>
-                <w:lang w:val="id-ID"/>
-              </w:rPr>
-              <w:t xml:space="preserve"> DPRD Kota Salatiga bermaksud melaksanakan kegiatan kunjungan kerja ke DPRD Kabupaten </w:t>
-            </w:r>
-            <w:r>
-              <w:rPr>
-                <w:rFonts w:hint="default" w:ascii="Arial" w:hAnsi="Arial" w:cs="Arial"/>
+                <w:rFonts w:hint="default" w:ascii="Times New Roman" w:hAnsi="Times New Roman" w:cs="Times New Roman"/>
+                <w:sz w:val="22"/>
+                <w:szCs w:val="22"/>
+                <w:lang w:val="id-ID"/>
+              </w:rPr>
+              <w:t xml:space="preserve"> DPRD Kota Salatiga bermaksud melaksanakan kegiatan kunjungan kerja ke DPRD </w:t>
+            </w:r>
+            <w:r>
+              <w:rPr>
+                <w:rFonts w:hint="default" w:ascii="Times New Roman" w:hAnsi="Times New Roman" w:cs="Times New Roman"/>
                 <w:sz w:val="22"/>
                 <w:szCs w:val="22"/>
                 <w:lang w:val="en-US"/>
               </w:rPr>
-              <w:t>{kabupaten/kota}</w:t>
-            </w:r>
-            <w:r>
-              <w:rPr>
-                <w:rFonts w:ascii="Arial" w:hAnsi="Arial" w:cs="Arial"/>
-                <w:sz w:val="22"/>
-                <w:szCs w:val="22"/>
-                <w:lang w:val="id-ID"/>
-              </w:rPr>
-              <w:t xml:space="preserve"> Provinsi </w:t>
-            </w:r>
-            <w:r>
-              <w:rPr>
-                <w:rFonts w:hint="default" w:ascii="Arial" w:hAnsi="Arial" w:cs="Arial"/>
+              <w:t>{kabupaten/kota} Provinsi {provinsi}</w:t>
+            </w:r>
+            <w:r>
+              <w:rPr>
+                <w:rFonts w:hint="default" w:ascii="Times New Roman" w:hAnsi="Times New Roman" w:cs="Times New Roman"/>
+                <w:sz w:val="22"/>
+                <w:szCs w:val="22"/>
+                <w:lang w:val="id-ID"/>
+              </w:rPr>
+              <w:t xml:space="preserve"> terkait mater</w:t>
+            </w:r>
+            <w:r>
+              <w:rPr>
+                <w:rFonts w:hint="default" w:ascii="Times New Roman" w:hAnsi="Times New Roman" w:cs="Times New Roman"/>
                 <w:sz w:val="22"/>
                 <w:szCs w:val="22"/>
                 <w:lang w:val="en-US"/>
               </w:rPr>
-              <w:t>{provinsi}</w:t>
-            </w:r>
-            <w:r>
-              <w:rPr>
-                <w:rFonts w:ascii="Arial" w:hAnsi="Arial" w:cs="Arial"/>
-                <w:sz w:val="22"/>
-                <w:szCs w:val="22"/>
-                <w:lang w:val="id-ID"/>
-              </w:rPr>
-              <w:t xml:space="preserve"> terkait mater</w:t>
-            </w:r>
-            <w:r>
-              <w:rPr>
-                <w:rFonts w:hint="default" w:ascii="Arial" w:hAnsi="Arial" w:cs="Arial"/>
+              <w:t>i</w:t>
+            </w:r>
+            <w:r>
+              <w:rPr>
+                <w:rFonts w:hint="default" w:ascii="Times New Roman" w:hAnsi="Times New Roman" w:cs="Times New Roman"/>
+                <w:sz w:val="22"/>
+                <w:szCs w:val="22"/>
+                <w:lang w:val="id-ID"/>
+              </w:rPr>
+              <w:t xml:space="preserve"> </w:t>
+            </w:r>
+            <w:r>
+              <w:rPr>
+                <w:rFonts w:hint="default" w:ascii="Times New Roman" w:hAnsi="Times New Roman" w:cs="Times New Roman"/>
                 <w:sz w:val="22"/>
                 <w:szCs w:val="22"/>
                 <w:lang w:val="en-US"/>
               </w:rPr>
-              <w:t>i</w:t>
-            </w:r>
-            <w:r>
-              <w:rPr>
-                <w:rFonts w:ascii="Arial" w:hAnsi="Arial" w:cs="Arial"/>
-                <w:sz w:val="22"/>
-                <w:szCs w:val="22"/>
-                <w:lang w:val="id-ID"/>
-              </w:rPr>
-              <w:t xml:space="preserve"> </w:t>
-            </w:r>
-            <w:r>
-              <w:rPr>
-                <w:rFonts w:hint="default" w:ascii="Arial" w:hAnsi="Arial" w:cs="Arial"/>
-                <w:sz w:val="22"/>
-                <w:szCs w:val="22"/>
-                <w:lang w:val="en-US"/>
-              </w:rPr>
               <w:t>{materi}</w:t>
             </w:r>
             <w:r>
               <w:rPr>
-                <w:rFonts w:ascii="Arial" w:hAnsi="Arial" w:cs="Arial"/>
+                <w:rFonts w:hint="default" w:ascii="Times New Roman" w:hAnsi="Times New Roman" w:cs="Times New Roman"/>
                 <w:sz w:val="22"/>
                 <w:szCs w:val="22"/>
                 <w:lang w:val="id-ID"/>
@@ -2325,7 +2326,7 @@
         <w:spacing w:line="360" w:lineRule="auto"/>
         <w:jc w:val="both"/>
         <w:rPr>
-          <w:rFonts w:ascii="Arial" w:hAnsi="Arial" w:cs="Arial"/>
+          <w:rFonts w:hint="default" w:ascii="Times New Roman" w:hAnsi="Times New Roman" w:cs="Times New Roman"/>
           <w:sz w:val="22"/>
           <w:szCs w:val="22"/>
           <w:lang w:val="sv-FI"/>
@@ -2340,7 +2341,7 @@
         <w:spacing w:line="360" w:lineRule="auto"/>
         <w:jc w:val="both"/>
         <w:rPr>
-          <w:rFonts w:ascii="Arial" w:hAnsi="Arial" w:cs="Arial"/>
+          <w:rFonts w:hint="default" w:ascii="Times New Roman" w:hAnsi="Times New Roman" w:cs="Times New Roman"/>
           <w:sz w:val="22"/>
           <w:szCs w:val="22"/>
           <w:lang w:val="sv-FI"/>
@@ -2355,7 +2356,7 @@
         <w:spacing w:line="360" w:lineRule="auto"/>
         <w:jc w:val="both"/>
         <w:rPr>
-          <w:rFonts w:ascii="Arial" w:hAnsi="Arial" w:cs="Arial"/>
+          <w:rFonts w:hint="default" w:ascii="Times New Roman" w:hAnsi="Times New Roman" w:cs="Times New Roman"/>
           <w:sz w:val="22"/>
           <w:szCs w:val="22"/>
           <w:lang w:val="sv-FI"/>
@@ -2370,7 +2371,7 @@
         <w:spacing w:line="360" w:lineRule="auto"/>
         <w:jc w:val="both"/>
         <w:rPr>
-          <w:rFonts w:ascii="Arial" w:hAnsi="Arial" w:cs="Arial"/>
+          <w:rFonts w:hint="default" w:ascii="Times New Roman" w:hAnsi="Times New Roman" w:cs="Times New Roman"/>
           <w:sz w:val="22"/>
           <w:szCs w:val="22"/>
           <w:lang w:val="sv-FI"/>
@@ -2385,7 +2386,7 @@
         <w:spacing w:line="360" w:lineRule="auto"/>
         <w:jc w:val="both"/>
         <w:rPr>
-          <w:rFonts w:ascii="Arial" w:hAnsi="Arial" w:cs="Arial"/>
+          <w:rFonts w:hint="default" w:ascii="Times New Roman" w:hAnsi="Times New Roman" w:cs="Times New Roman"/>
           <w:sz w:val="22"/>
           <w:szCs w:val="22"/>
           <w:lang w:val="sv-FI"/>
@@ -2400,7 +2401,7 @@
         <w:spacing w:line="360" w:lineRule="auto"/>
         <w:jc w:val="both"/>
         <w:rPr>
-          <w:rFonts w:ascii="Arial" w:hAnsi="Arial" w:cs="Arial"/>
+          <w:rFonts w:hint="default" w:ascii="Times New Roman" w:hAnsi="Times New Roman" w:cs="Times New Roman"/>
           <w:sz w:val="22"/>
           <w:szCs w:val="22"/>
           <w:lang w:val="sv-FI"/>
@@ -2463,15 +2464,15 @@
               <w:spacing w:line="360" w:lineRule="auto"/>
               <w:jc w:val="both"/>
               <w:rPr>
-                <w:rFonts w:ascii="Arial" w:hAnsi="Arial" w:cs="Arial"/>
-                <w:sz w:val="22"/>
-                <w:szCs w:val="22"/>
-                <w:lang w:val="id-ID"/>
-              </w:rPr>
-            </w:pPr>
-            <w:r>
-              <w:rPr>
-                <w:rFonts w:ascii="Arial" w:hAnsi="Arial" w:cs="Arial"/>
+                <w:rFonts w:hint="default" w:ascii="Times New Roman" w:hAnsi="Times New Roman" w:cs="Times New Roman"/>
+                <w:sz w:val="22"/>
+                <w:szCs w:val="22"/>
+                <w:lang w:val="id-ID"/>
+              </w:rPr>
+            </w:pPr>
+            <w:r>
+              <w:rPr>
+                <w:rFonts w:hint="default" w:ascii="Times New Roman" w:hAnsi="Times New Roman" w:cs="Times New Roman"/>
                 <w:sz w:val="22"/>
                 <w:szCs w:val="22"/>
                 <w:lang w:val="id-ID"/>
@@ -2492,15 +2493,15 @@
               <w:spacing w:line="360" w:lineRule="auto"/>
               <w:jc w:val="both"/>
               <w:rPr>
-                <w:rFonts w:ascii="Arial" w:hAnsi="Arial" w:cs="Arial"/>
-                <w:sz w:val="22"/>
-                <w:szCs w:val="22"/>
-                <w:lang w:val="id-ID"/>
-              </w:rPr>
-            </w:pPr>
-            <w:r>
-              <w:rPr>
-                <w:rFonts w:ascii="Arial" w:hAnsi="Arial" w:cs="Arial"/>
+                <w:rFonts w:hint="default" w:ascii="Times New Roman" w:hAnsi="Times New Roman" w:cs="Times New Roman"/>
+                <w:sz w:val="22"/>
+                <w:szCs w:val="22"/>
+                <w:lang w:val="id-ID"/>
+              </w:rPr>
+            </w:pPr>
+            <w:r>
+              <w:rPr>
+                <w:rFonts w:hint="default" w:ascii="Times New Roman" w:hAnsi="Times New Roman" w:cs="Times New Roman"/>
                 <w:sz w:val="22"/>
                 <w:szCs w:val="22"/>
                 <w:lang w:val="id-ID"/>
@@ -2521,7 +2522,7 @@
               <w:spacing w:line="360" w:lineRule="auto"/>
               <w:jc w:val="both"/>
               <w:rPr>
-                <w:rFonts w:hint="default" w:ascii="Arial" w:hAnsi="Arial" w:cs="Arial"/>
+                <w:rFonts w:hint="default" w:ascii="Times New Roman" w:hAnsi="Times New Roman" w:cs="Times New Roman"/>
                 <w:sz w:val="22"/>
                 <w:szCs w:val="22"/>
                 <w:lang w:val="en-US"/>
@@ -2529,7 +2530,7 @@
             </w:pPr>
             <w:r>
               <w:rPr>
-                <w:rFonts w:ascii="Arial" w:hAnsi="Arial" w:cs="Arial"/>
+                <w:rFonts w:hint="default" w:ascii="Times New Roman" w:hAnsi="Times New Roman" w:cs="Times New Roman"/>
                 <w:sz w:val="22"/>
                 <w:szCs w:val="22"/>
                 <w:lang w:val="id-ID"/>
@@ -2538,7 +2539,7 @@
             </w:r>
             <w:r>
               <w:rPr>
-                <w:rFonts w:hint="default" w:ascii="Arial" w:hAnsi="Arial" w:cs="Arial"/>
+                <w:rFonts w:hint="default" w:ascii="Times New Roman" w:hAnsi="Times New Roman" w:cs="Times New Roman"/>
                 <w:sz w:val="22"/>
                 <w:szCs w:val="22"/>
                 <w:lang w:val="en-US"/>
@@ -2577,15 +2578,15 @@
               <w:spacing w:line="360" w:lineRule="auto"/>
               <w:jc w:val="both"/>
               <w:rPr>
-                <w:rFonts w:ascii="Arial" w:hAnsi="Arial" w:cs="Arial"/>
-                <w:sz w:val="22"/>
-                <w:szCs w:val="22"/>
-                <w:lang w:val="id-ID"/>
-              </w:rPr>
-            </w:pPr>
-            <w:r>
-              <w:rPr>
-                <w:rFonts w:ascii="Arial" w:hAnsi="Arial" w:cs="Arial"/>
+                <w:rFonts w:hint="default" w:ascii="Times New Roman" w:hAnsi="Times New Roman" w:cs="Times New Roman"/>
+                <w:sz w:val="22"/>
+                <w:szCs w:val="22"/>
+                <w:lang w:val="id-ID"/>
+              </w:rPr>
+            </w:pPr>
+            <w:r>
+              <w:rPr>
+                <w:rFonts w:hint="default" w:ascii="Times New Roman" w:hAnsi="Times New Roman" w:cs="Times New Roman"/>
                 <w:sz w:val="22"/>
                 <w:szCs w:val="22"/>
                 <w:lang w:val="id-ID"/>
@@ -2606,15 +2607,15 @@
               <w:spacing w:line="360" w:lineRule="auto"/>
               <w:jc w:val="both"/>
               <w:rPr>
-                <w:rFonts w:ascii="Arial" w:hAnsi="Arial" w:cs="Arial"/>
-                <w:sz w:val="22"/>
-                <w:szCs w:val="22"/>
-                <w:lang w:val="id-ID"/>
-              </w:rPr>
-            </w:pPr>
-            <w:r>
-              <w:rPr>
-                <w:rFonts w:ascii="Arial" w:hAnsi="Arial" w:cs="Arial"/>
+                <w:rFonts w:hint="default" w:ascii="Times New Roman" w:hAnsi="Times New Roman" w:cs="Times New Roman"/>
+                <w:sz w:val="22"/>
+                <w:szCs w:val="22"/>
+                <w:lang w:val="id-ID"/>
+              </w:rPr>
+            </w:pPr>
+            <w:r>
+              <w:rPr>
+                <w:rFonts w:hint="default" w:ascii="Times New Roman" w:hAnsi="Times New Roman" w:cs="Times New Roman"/>
                 <w:sz w:val="22"/>
                 <w:szCs w:val="22"/>
                 <w:lang w:val="id-ID"/>
@@ -2635,7 +2636,7 @@
               <w:spacing w:line="360" w:lineRule="auto"/>
               <w:jc w:val="both"/>
               <w:rPr>
-                <w:rFonts w:hint="default" w:ascii="Arial" w:hAnsi="Arial" w:cs="Arial"/>
+                <w:rFonts w:hint="default" w:ascii="Times New Roman" w:hAnsi="Times New Roman" w:cs="Times New Roman"/>
                 <w:sz w:val="22"/>
                 <w:szCs w:val="22"/>
                 <w:lang w:val="en-US"/>
@@ -2643,7 +2644,7 @@
             </w:pPr>
             <w:r>
               <w:rPr>
-                <w:rFonts w:ascii="Arial" w:hAnsi="Arial" w:cs="Arial"/>
+                <w:rFonts w:hint="default" w:ascii="Times New Roman" w:hAnsi="Times New Roman" w:cs="Times New Roman"/>
                 <w:sz w:val="22"/>
                 <w:szCs w:val="22"/>
                 <w:lang w:val="id-ID"/>
@@ -2652,7 +2653,7 @@
             </w:r>
             <w:r>
               <w:rPr>
-                <w:rFonts w:hint="default" w:ascii="Arial" w:hAnsi="Arial" w:cs="Arial"/>
+                <w:rFonts w:hint="default" w:ascii="Times New Roman" w:hAnsi="Times New Roman" w:cs="Times New Roman"/>
                 <w:sz w:val="22"/>
                 <w:szCs w:val="22"/>
                 <w:lang w:val="en-US"/>
@@ -2691,15 +2692,15 @@
               <w:spacing w:line="360" w:lineRule="auto"/>
               <w:jc w:val="both"/>
               <w:rPr>
-                <w:rFonts w:ascii="Arial" w:hAnsi="Arial" w:cs="Arial"/>
-                <w:sz w:val="22"/>
-                <w:szCs w:val="22"/>
-                <w:lang w:val="id-ID"/>
-              </w:rPr>
-            </w:pPr>
-            <w:r>
-              <w:rPr>
-                <w:rFonts w:ascii="Arial" w:hAnsi="Arial" w:cs="Arial"/>
+                <w:rFonts w:hint="default" w:ascii="Times New Roman" w:hAnsi="Times New Roman" w:cs="Times New Roman"/>
+                <w:sz w:val="22"/>
+                <w:szCs w:val="22"/>
+                <w:lang w:val="id-ID"/>
+              </w:rPr>
+            </w:pPr>
+            <w:r>
+              <w:rPr>
+                <w:rFonts w:hint="default" w:ascii="Times New Roman" w:hAnsi="Times New Roman" w:cs="Times New Roman"/>
                 <w:sz w:val="22"/>
                 <w:szCs w:val="22"/>
                 <w:lang w:val="id-ID"/>
@@ -2720,15 +2721,15 @@
               <w:spacing w:line="360" w:lineRule="auto"/>
               <w:jc w:val="both"/>
               <w:rPr>
-                <w:rFonts w:ascii="Arial" w:hAnsi="Arial" w:cs="Arial"/>
-                <w:sz w:val="22"/>
-                <w:szCs w:val="22"/>
-                <w:lang w:val="id-ID"/>
-              </w:rPr>
-            </w:pPr>
-            <w:r>
-              <w:rPr>
-                <w:rFonts w:ascii="Arial" w:hAnsi="Arial" w:cs="Arial"/>
+                <w:rFonts w:hint="default" w:ascii="Times New Roman" w:hAnsi="Times New Roman" w:cs="Times New Roman"/>
+                <w:sz w:val="22"/>
+                <w:szCs w:val="22"/>
+                <w:lang w:val="id-ID"/>
+              </w:rPr>
+            </w:pPr>
+            <w:r>
+              <w:rPr>
+                <w:rFonts w:hint="default" w:ascii="Times New Roman" w:hAnsi="Times New Roman" w:cs="Times New Roman"/>
                 <w:sz w:val="22"/>
                 <w:szCs w:val="22"/>
                 <w:lang w:val="id-ID"/>
@@ -2749,15 +2750,15 @@
               <w:spacing w:line="360" w:lineRule="auto"/>
               <w:jc w:val="both"/>
               <w:rPr>
-                <w:rFonts w:ascii="Arial" w:hAnsi="Arial" w:cs="Arial"/>
-                <w:sz w:val="22"/>
-                <w:szCs w:val="22"/>
-                <w:lang w:val="id-ID"/>
-              </w:rPr>
-            </w:pPr>
-            <w:r>
-              <w:rPr>
-                <w:rFonts w:ascii="Arial" w:hAnsi="Arial" w:cs="Arial"/>
+                <w:rFonts w:hint="default" w:ascii="Times New Roman" w:hAnsi="Times New Roman" w:cs="Times New Roman"/>
+                <w:sz w:val="22"/>
+                <w:szCs w:val="22"/>
+                <w:lang w:val="id-ID"/>
+              </w:rPr>
+            </w:pPr>
+            <w:r>
+              <w:rPr>
+                <w:rFonts w:hint="default" w:ascii="Times New Roman" w:hAnsi="Times New Roman" w:cs="Times New Roman"/>
                 <w:sz w:val="22"/>
                 <w:szCs w:val="22"/>
                 <w:lang w:val="id-ID"/>
@@ -2766,7 +2767,7 @@
             </w:r>
             <w:r>
               <w:rPr>
-                <w:rFonts w:hint="default" w:ascii="Arial" w:hAnsi="Arial" w:cs="Arial"/>
+                <w:rFonts w:hint="default" w:ascii="Times New Roman" w:hAnsi="Times New Roman" w:cs="Times New Roman"/>
                 <w:sz w:val="22"/>
                 <w:szCs w:val="22"/>
                 <w:lang w:val="en-US"/>
@@ -2775,7 +2776,7 @@
             </w:r>
             <w:r>
               <w:rPr>
-                <w:rFonts w:ascii="Arial" w:hAnsi="Arial" w:cs="Arial"/>
+                <w:rFonts w:hint="default" w:ascii="Times New Roman" w:hAnsi="Times New Roman" w:cs="Times New Roman"/>
                 <w:sz w:val="22"/>
                 <w:szCs w:val="22"/>
                 <w:lang w:val="id-ID"/>
@@ -2808,15 +2809,15 @@
               <w:spacing w:line="360" w:lineRule="auto"/>
               <w:jc w:val="both"/>
               <w:rPr>
-                <w:rFonts w:ascii="Arial" w:hAnsi="Arial" w:cs="Arial"/>
-                <w:sz w:val="22"/>
-                <w:szCs w:val="22"/>
-                <w:lang w:val="id-ID"/>
-              </w:rPr>
-            </w:pPr>
-            <w:r>
-              <w:rPr>
-                <w:rFonts w:ascii="Arial" w:hAnsi="Arial" w:cs="Arial"/>
+                <w:rFonts w:hint="default" w:ascii="Times New Roman" w:hAnsi="Times New Roman" w:cs="Times New Roman"/>
+                <w:sz w:val="22"/>
+                <w:szCs w:val="22"/>
+                <w:lang w:val="id-ID"/>
+              </w:rPr>
+            </w:pPr>
+            <w:r>
+              <w:rPr>
+                <w:rFonts w:hint="default" w:ascii="Times New Roman" w:hAnsi="Times New Roman" w:cs="Times New Roman"/>
                 <w:sz w:val="22"/>
                 <w:szCs w:val="22"/>
                 <w:lang w:val="id-ID"/>
@@ -2837,15 +2838,15 @@
               <w:spacing w:line="360" w:lineRule="auto"/>
               <w:jc w:val="both"/>
               <w:rPr>
-                <w:rFonts w:ascii="Arial" w:hAnsi="Arial" w:cs="Arial"/>
-                <w:sz w:val="22"/>
-                <w:szCs w:val="22"/>
-                <w:lang w:val="id-ID"/>
-              </w:rPr>
-            </w:pPr>
-            <w:r>
-              <w:rPr>
-                <w:rFonts w:ascii="Arial" w:hAnsi="Arial" w:cs="Arial"/>
+                <w:rFonts w:hint="default" w:ascii="Times New Roman" w:hAnsi="Times New Roman" w:cs="Times New Roman"/>
+                <w:sz w:val="22"/>
+                <w:szCs w:val="22"/>
+                <w:lang w:val="id-ID"/>
+              </w:rPr>
+            </w:pPr>
+            <w:r>
+              <w:rPr>
+                <w:rFonts w:hint="default" w:ascii="Times New Roman" w:hAnsi="Times New Roman" w:cs="Times New Roman"/>
                 <w:sz w:val="22"/>
                 <w:szCs w:val="22"/>
                 <w:lang w:val="id-ID"/>
@@ -2866,15 +2867,15 @@
               <w:spacing w:line="360" w:lineRule="auto"/>
               <w:jc w:val="both"/>
               <w:rPr>
-                <w:rFonts w:ascii="Arial" w:hAnsi="Arial" w:cs="Arial"/>
-                <w:sz w:val="22"/>
-                <w:szCs w:val="22"/>
-                <w:lang w:val="id-ID"/>
-              </w:rPr>
-            </w:pPr>
-            <w:r>
-              <w:rPr>
-                <w:rFonts w:ascii="Arial" w:hAnsi="Arial" w:cs="Arial"/>
+                <w:rFonts w:hint="default" w:ascii="Times New Roman" w:hAnsi="Times New Roman" w:cs="Times New Roman"/>
+                <w:sz w:val="22"/>
+                <w:szCs w:val="22"/>
+                <w:lang w:val="id-ID"/>
+              </w:rPr>
+            </w:pPr>
+            <w:r>
+              <w:rPr>
+                <w:rFonts w:hint="default" w:ascii="Times New Roman" w:hAnsi="Times New Roman" w:cs="Times New Roman"/>
                 <w:sz w:val="22"/>
                 <w:szCs w:val="22"/>
                 <w:lang w:val="id-ID"/>
@@ -2883,7 +2884,7 @@
             </w:r>
             <w:r>
               <w:rPr>
-                <w:rFonts w:ascii="Arial" w:hAnsi="Arial" w:cs="Arial"/>
+                <w:rFonts w:hint="default" w:ascii="Times New Roman" w:hAnsi="Times New Roman" w:cs="Times New Roman"/>
                 <w:sz w:val="22"/>
                 <w:szCs w:val="22"/>
                 <w:u w:val="single"/>
@@ -2893,7 +2894,7 @@
             </w:r>
             <w:r>
               <w:rPr>
-                <w:rFonts w:hint="default" w:ascii="Arial" w:hAnsi="Arial" w:cs="Arial"/>
+                <w:rFonts w:hint="default" w:ascii="Times New Roman" w:hAnsi="Times New Roman" w:cs="Times New Roman"/>
                 <w:sz w:val="22"/>
                 <w:szCs w:val="22"/>
                 <w:lang w:val="en-US"/>
@@ -2902,7 +2903,7 @@
             </w:r>
             <w:r>
               <w:rPr>
-                <w:rFonts w:ascii="Arial" w:hAnsi="Arial" w:cs="Arial"/>
+                <w:rFonts w:hint="default" w:ascii="Times New Roman" w:hAnsi="Times New Roman" w:cs="Times New Roman"/>
                 <w:sz w:val="22"/>
                 <w:szCs w:val="22"/>
                 <w:lang w:val="id-ID"/>
@@ -2914,42 +2915,30 @@
             <w:pPr>
               <w:pStyle w:val="30"/>
               <w:numPr>
-                <w:ilvl w:val="0"/>
-                <w:numId w:val="1"/>
+                <w:numId w:val="0"/>
               </w:numPr>
               <w:tabs>
                 <w:tab w:val="center" w:pos="7371"/>
               </w:tabs>
               <w:spacing w:line="360" w:lineRule="auto"/>
-              <w:ind w:left="460" w:hanging="284"/>
+              <w:ind w:left="176" w:leftChars="0"/>
               <w:jc w:val="both"/>
               <w:rPr>
-                <w:rFonts w:ascii="Arial" w:hAnsi="Arial" w:cs="Arial"/>
-                <w:sz w:val="22"/>
-                <w:szCs w:val="22"/>
-                <w:lang w:val="id-ID"/>
-              </w:rPr>
-            </w:pPr>
-            <w:r>
-              <w:rPr>
-                <w:rFonts w:ascii="Arial" w:hAnsi="Arial" w:cs="Arial"/>
-                <w:sz w:val="22"/>
-                <w:szCs w:val="22"/>
-                <w:lang w:val="id-ID"/>
-              </w:rPr>
-              <w:t xml:space="preserve">  </w:t>
-            </w:r>
-            <w:r>
-              <w:rPr>
-                <w:rFonts w:hint="default" w:ascii="Arial" w:hAnsi="Arial" w:cs="Arial"/>
+                <w:rFonts w:hint="default" w:ascii="Times New Roman" w:hAnsi="Times New Roman" w:cs="Times New Roman"/>
+                <w:sz w:val="22"/>
+                <w:szCs w:val="22"/>
+                <w:lang w:val="id-ID"/>
+              </w:rPr>
+            </w:pPr>
+            <w:r>
+              <w:rPr>
+                <w:rFonts w:hint="default" w:ascii="Times New Roman" w:hAnsi="Times New Roman" w:cs="Times New Roman"/>
                 <w:sz w:val="22"/>
                 <w:szCs w:val="22"/>
                 <w:lang w:val="en-US"/>
               </w:rPr>
               <w:t xml:space="preserve">{rincian_jumlah} </w:t>
             </w:r>
-            <w:bookmarkStart w:id="0" w:name="_GoBack"/>
-            <w:bookmarkEnd w:id="0"/>
           </w:p>
         </w:tc>
       </w:tr>
@@ -2962,7 +2951,7 @@
         <w:spacing w:line="360" w:lineRule="auto"/>
         <w:jc w:val="both"/>
         <w:rPr>
-          <w:rFonts w:ascii="Arial" w:hAnsi="Arial" w:cs="Arial"/>
+          <w:rFonts w:hint="default" w:ascii="Times New Roman" w:hAnsi="Times New Roman" w:cs="Times New Roman"/>
           <w:sz w:val="22"/>
           <w:szCs w:val="22"/>
           <w:lang w:val="sv-FI"/>
@@ -2977,7 +2966,7 @@
         <w:spacing w:line="360" w:lineRule="auto"/>
         <w:jc w:val="both"/>
         <w:rPr>
-          <w:rFonts w:ascii="Arial" w:hAnsi="Arial" w:cs="Arial"/>
+          <w:rFonts w:hint="default" w:ascii="Times New Roman" w:hAnsi="Times New Roman" w:cs="Times New Roman"/>
           <w:sz w:val="22"/>
           <w:szCs w:val="22"/>
           <w:lang w:val="sv-FI"/>
@@ -2992,7 +2981,7 @@
         <w:spacing w:line="360" w:lineRule="auto"/>
         <w:jc w:val="both"/>
         <w:rPr>
-          <w:rFonts w:ascii="Arial" w:hAnsi="Arial" w:cs="Arial"/>
+          <w:rFonts w:hint="default" w:ascii="Times New Roman" w:hAnsi="Times New Roman" w:cs="Times New Roman"/>
           <w:sz w:val="22"/>
           <w:szCs w:val="22"/>
           <w:lang w:val="id-ID"/>
@@ -3007,7 +2996,7 @@
         <w:spacing w:line="360" w:lineRule="auto"/>
         <w:jc w:val="both"/>
         <w:rPr>
-          <w:rFonts w:ascii="Arial" w:hAnsi="Arial" w:cs="Arial"/>
+          <w:rFonts w:hint="default" w:ascii="Times New Roman" w:hAnsi="Times New Roman" w:cs="Times New Roman"/>
           <w:sz w:val="22"/>
           <w:szCs w:val="22"/>
           <w:lang w:val="sv-FI"/>
@@ -3022,7 +3011,7 @@
         <w:spacing w:line="360" w:lineRule="auto"/>
         <w:jc w:val="both"/>
         <w:rPr>
-          <w:rFonts w:ascii="Arial" w:hAnsi="Arial" w:cs="Arial"/>
+          <w:rFonts w:hint="default" w:ascii="Times New Roman" w:hAnsi="Times New Roman" w:cs="Times New Roman"/>
           <w:sz w:val="22"/>
           <w:szCs w:val="22"/>
           <w:lang w:val="sv-FI"/>
@@ -3037,7 +3026,7 @@
         <w:spacing w:line="360" w:lineRule="auto"/>
         <w:jc w:val="both"/>
         <w:rPr>
-          <w:rFonts w:ascii="Arial" w:hAnsi="Arial" w:cs="Arial"/>
+          <w:rFonts w:hint="default" w:ascii="Times New Roman" w:hAnsi="Times New Roman" w:cs="Times New Roman"/>
           <w:sz w:val="22"/>
           <w:szCs w:val="22"/>
           <w:lang w:val="sv-FI"/>
@@ -3052,7 +3041,7 @@
         <w:spacing w:line="360" w:lineRule="auto"/>
         <w:jc w:val="both"/>
         <w:rPr>
-          <w:rFonts w:ascii="Arial" w:hAnsi="Arial" w:cs="Arial"/>
+          <w:rFonts w:hint="default" w:ascii="Times New Roman" w:hAnsi="Times New Roman" w:cs="Times New Roman"/>
           <w:sz w:val="22"/>
           <w:szCs w:val="22"/>
           <w:lang w:val="sv-FI"/>
@@ -3067,7 +3056,7 @@
         <w:spacing w:line="360" w:lineRule="auto"/>
         <w:jc w:val="both"/>
         <w:rPr>
-          <w:rFonts w:ascii="Arial" w:hAnsi="Arial" w:cs="Arial"/>
+          <w:rFonts w:hint="default" w:ascii="Times New Roman" w:hAnsi="Times New Roman" w:cs="Times New Roman"/>
           <w:sz w:val="22"/>
           <w:szCs w:val="22"/>
           <w:lang w:val="sv-FI"/>
@@ -3129,15 +3118,15 @@
               <w:ind w:left="880" w:hanging="426"/>
               <w:jc w:val="both"/>
               <w:rPr>
-                <w:rFonts w:ascii="Arial" w:hAnsi="Arial" w:cs="Arial"/>
-                <w:sz w:val="22"/>
-                <w:szCs w:val="22"/>
-                <w:lang w:val="id-ID"/>
-              </w:rPr>
-            </w:pPr>
-            <w:r>
-              <w:rPr>
-                <w:rFonts w:ascii="Arial" w:hAnsi="Arial" w:cs="Arial"/>
+                <w:rFonts w:hint="default" w:ascii="Times New Roman" w:hAnsi="Times New Roman" w:cs="Times New Roman"/>
+                <w:sz w:val="22"/>
+                <w:szCs w:val="22"/>
+                <w:lang w:val="id-ID"/>
+              </w:rPr>
+            </w:pPr>
+            <w:r>
+              <w:rPr>
+                <w:rFonts w:hint="default" w:ascii="Times New Roman" w:hAnsi="Times New Roman" w:cs="Times New Roman"/>
                 <w:sz w:val="22"/>
                 <w:szCs w:val="22"/>
                 <w:lang w:val="id-ID"/>
@@ -3153,15 +3142,15 @@
               <w:spacing w:line="360" w:lineRule="auto"/>
               <w:jc w:val="both"/>
               <w:rPr>
-                <w:rFonts w:ascii="Arial" w:hAnsi="Arial" w:cs="Arial"/>
-                <w:sz w:val="22"/>
-                <w:szCs w:val="22"/>
-                <w:lang w:val="id-ID"/>
-              </w:rPr>
-            </w:pPr>
-            <w:r>
-              <w:rPr>
-                <w:rFonts w:ascii="Arial" w:hAnsi="Arial" w:cs="Arial"/>
+                <w:rFonts w:hint="default" w:ascii="Times New Roman" w:hAnsi="Times New Roman" w:cs="Times New Roman"/>
+                <w:sz w:val="22"/>
+                <w:szCs w:val="22"/>
+                <w:lang w:val="id-ID"/>
+              </w:rPr>
+            </w:pPr>
+            <w:r>
+              <w:rPr>
+                <w:rFonts w:hint="default" w:ascii="Times New Roman" w:hAnsi="Times New Roman" w:cs="Times New Roman"/>
                 <w:sz w:val="22"/>
                 <w:szCs w:val="22"/>
                 <w:lang w:val="id-ID"/>
@@ -3177,7 +3166,7 @@
               <w:spacing w:line="360" w:lineRule="auto"/>
               <w:jc w:val="both"/>
               <w:rPr>
-                <w:rFonts w:ascii="Arial" w:hAnsi="Arial" w:cs="Arial"/>
+                <w:rFonts w:hint="default" w:ascii="Times New Roman" w:hAnsi="Times New Roman" w:cs="Times New Roman"/>
                 <w:i/>
                 <w:sz w:val="22"/>
                 <w:szCs w:val="22"/>
@@ -3186,7 +3175,7 @@
             </w:pPr>
             <w:r>
               <w:rPr>
-                <w:rFonts w:ascii="Arial" w:hAnsi="Arial" w:cs="Arial"/>
+                <w:rFonts w:hint="default" w:ascii="Times New Roman" w:hAnsi="Times New Roman" w:cs="Times New Roman"/>
                 <w:sz w:val="22"/>
                 <w:szCs w:val="22"/>
                 <w:lang w:val="id-ID"/>
@@ -3195,7 +3184,7 @@
             </w:r>
             <w:r>
               <w:rPr>
-                <w:rFonts w:ascii="Arial" w:hAnsi="Arial" w:cs="Arial"/>
+                <w:rFonts w:hint="default" w:ascii="Times New Roman" w:hAnsi="Times New Roman" w:cs="Times New Roman"/>
                 <w:i/>
                 <w:sz w:val="22"/>
                 <w:szCs w:val="22"/>
@@ -3213,15 +3202,15 @@
               <w:ind w:firstLine="596"/>
               <w:jc w:val="both"/>
               <w:rPr>
-                <w:rFonts w:ascii="Arial" w:hAnsi="Arial" w:cs="Arial"/>
-                <w:sz w:val="22"/>
-                <w:szCs w:val="22"/>
-                <w:lang w:val="id-ID"/>
-              </w:rPr>
-            </w:pPr>
-            <w:r>
-              <w:rPr>
-                <w:rFonts w:ascii="Arial" w:hAnsi="Arial" w:cs="Arial"/>
+                <w:rFonts w:hint="default" w:ascii="Times New Roman" w:hAnsi="Times New Roman" w:cs="Times New Roman"/>
+                <w:sz w:val="22"/>
+                <w:szCs w:val="22"/>
+                <w:lang w:val="id-ID"/>
+              </w:rPr>
+            </w:pPr>
+            <w:r>
+              <w:rPr>
+                <w:rFonts w:hint="default" w:ascii="Times New Roman" w:hAnsi="Times New Roman" w:cs="Times New Roman"/>
                 <w:sz w:val="22"/>
                 <w:szCs w:val="22"/>
                 <w:lang w:val="id-ID"/>
@@ -3237,15 +3226,15 @@
               <w:spacing w:line="360" w:lineRule="auto"/>
               <w:jc w:val="both"/>
               <w:rPr>
-                <w:rFonts w:ascii="Arial" w:hAnsi="Arial" w:cs="Arial"/>
-                <w:sz w:val="22"/>
-                <w:szCs w:val="22"/>
-                <w:lang w:val="id-ID"/>
-              </w:rPr>
-            </w:pPr>
-            <w:r>
-              <w:rPr>
-                <w:rFonts w:ascii="Arial" w:hAnsi="Arial" w:cs="Arial"/>
+                <w:rFonts w:hint="default" w:ascii="Times New Roman" w:hAnsi="Times New Roman" w:cs="Times New Roman"/>
+                <w:sz w:val="22"/>
+                <w:szCs w:val="22"/>
+                <w:lang w:val="id-ID"/>
+              </w:rPr>
+            </w:pPr>
+            <w:r>
+              <w:rPr>
+                <w:rFonts w:hint="default" w:ascii="Times New Roman" w:hAnsi="Times New Roman" w:cs="Times New Roman"/>
                 <w:sz w:val="22"/>
                 <w:szCs w:val="22"/>
                 <w:lang w:val="id-ID"/>
@@ -3264,7 +3253,7 @@
         <w:spacing w:line="360" w:lineRule="auto"/>
         <w:jc w:val="both"/>
         <w:rPr>
-          <w:rFonts w:ascii="Arial" w:hAnsi="Arial" w:cs="Arial"/>
+          <w:rFonts w:hint="default" w:ascii="Times New Roman" w:hAnsi="Times New Roman" w:cs="Times New Roman"/>
           <w:sz w:val="22"/>
           <w:szCs w:val="22"/>
           <w:lang w:val="sv-FI"/>
@@ -3279,7 +3268,7 @@
         <w:spacing w:line="360" w:lineRule="auto"/>
         <w:jc w:val="both"/>
         <w:rPr>
-          <w:rFonts w:ascii="Arial" w:hAnsi="Arial" w:cs="Arial"/>
+          <w:rFonts w:hint="default" w:ascii="Times New Roman" w:hAnsi="Times New Roman" w:cs="Times New Roman"/>
           <w:sz w:val="22"/>
           <w:szCs w:val="22"/>
           <w:lang w:val="sv-FI"/>
@@ -3294,7 +3283,7 @@
         <w:spacing w:line="360" w:lineRule="auto"/>
         <w:jc w:val="both"/>
         <w:rPr>
-          <w:rFonts w:ascii="Arial" w:hAnsi="Arial" w:cs="Arial"/>
+          <w:rFonts w:hint="default" w:ascii="Times New Roman" w:hAnsi="Times New Roman" w:cs="Times New Roman"/>
           <w:sz w:val="22"/>
           <w:szCs w:val="22"/>
           <w:lang w:val="sv-FI"/>
@@ -3309,7 +3298,7 @@
         <w:spacing w:line="360" w:lineRule="auto"/>
         <w:jc w:val="both"/>
         <w:rPr>
-          <w:rFonts w:ascii="Arial" w:hAnsi="Arial" w:cs="Arial"/>
+          <w:rFonts w:hint="default" w:ascii="Times New Roman" w:hAnsi="Times New Roman" w:cs="Times New Roman"/>
           <w:sz w:val="22"/>
           <w:szCs w:val="22"/>
           <w:lang w:val="sv-FI"/>
@@ -3324,7 +3313,7 @@
         <w:spacing w:line="360" w:lineRule="auto"/>
         <w:jc w:val="both"/>
         <w:rPr>
-          <w:rFonts w:ascii="Arial" w:hAnsi="Arial" w:cs="Arial"/>
+          <w:rFonts w:hint="default" w:ascii="Times New Roman" w:hAnsi="Times New Roman" w:cs="Times New Roman"/>
           <w:sz w:val="22"/>
           <w:szCs w:val="22"/>
           <w:lang w:val="sv-FI"/>
@@ -3339,7 +3328,7 @@
         <w:spacing w:line="360" w:lineRule="auto"/>
         <w:jc w:val="both"/>
         <w:rPr>
-          <w:rFonts w:ascii="Arial" w:hAnsi="Arial" w:cs="Arial"/>
+          <w:rFonts w:hint="default" w:ascii="Times New Roman" w:hAnsi="Times New Roman" w:cs="Times New Roman"/>
           <w:sz w:val="22"/>
           <w:szCs w:val="22"/>
           <w:lang w:val="sv-FI"/>
@@ -3398,15 +3387,15 @@
               <w:spacing w:line="360" w:lineRule="auto"/>
               <w:jc w:val="center"/>
               <w:rPr>
-                <w:rFonts w:ascii="Arial" w:hAnsi="Arial" w:cs="Arial"/>
-                <w:sz w:val="22"/>
-                <w:szCs w:val="22"/>
-                <w:lang w:val="id-ID"/>
-              </w:rPr>
-            </w:pPr>
-            <w:r>
-              <w:rPr>
-                <w:rFonts w:ascii="Arial" w:hAnsi="Arial" w:cs="Arial"/>
+                <w:rFonts w:hint="default" w:ascii="Times New Roman" w:hAnsi="Times New Roman" w:cs="Times New Roman"/>
+                <w:sz w:val="22"/>
+                <w:szCs w:val="22"/>
+                <w:lang w:val="id-ID"/>
+              </w:rPr>
+            </w:pPr>
+            <w:r>
+              <w:rPr>
+                <w:rFonts w:hint="default" w:ascii="Times New Roman" w:hAnsi="Times New Roman" w:cs="Times New Roman"/>
                 <w:sz w:val="22"/>
                 <w:szCs w:val="22"/>
                 <w:lang w:val="id-ID"/>
@@ -3420,7 +3409,7 @@
               <w:spacing w:line="360" w:lineRule="auto"/>
               <w:jc w:val="center"/>
               <w:rPr>
-                <w:rFonts w:ascii="Arial" w:hAnsi="Arial" w:cs="Arial"/>
+                <w:rFonts w:hint="default" w:ascii="Times New Roman" w:hAnsi="Times New Roman" w:cs="Times New Roman"/>
                 <w:color w:val="000000"/>
                 <w:sz w:val="22"/>
                 <w:szCs w:val="22"/>
@@ -3429,7 +3418,7 @@
             </w:pPr>
             <w:r>
               <w:rPr>
-                <w:rFonts w:ascii="Arial" w:hAnsi="Arial" w:cs="Arial"/>
+                <w:rFonts w:hint="default" w:ascii="Times New Roman" w:hAnsi="Times New Roman" w:cs="Times New Roman"/>
                 <w:color w:val="000000"/>
                 <w:sz w:val="22"/>
                 <w:szCs w:val="22"/>
@@ -3444,7 +3433,7 @@
               <w:spacing w:line="360" w:lineRule="auto"/>
               <w:jc w:val="center"/>
               <w:rPr>
-                <w:rFonts w:ascii="Arial" w:hAnsi="Arial" w:cs="Arial"/>
+                <w:rFonts w:hint="default" w:ascii="Times New Roman" w:hAnsi="Times New Roman" w:cs="Times New Roman"/>
                 <w:color w:val="000000"/>
                 <w:sz w:val="22"/>
                 <w:szCs w:val="22"/>
@@ -3453,7 +3442,7 @@
             </w:pPr>
             <w:r>
               <w:rPr>
-                <w:rFonts w:ascii="Arial" w:hAnsi="Arial" w:cs="Arial"/>
+                <w:rFonts w:hint="default" w:ascii="Times New Roman" w:hAnsi="Times New Roman" w:cs="Times New Roman"/>
                 <w:color w:val="000000"/>
                 <w:sz w:val="22"/>
                 <w:szCs w:val="22"/>
@@ -3468,7 +3457,7 @@
               <w:spacing w:line="360" w:lineRule="auto"/>
               <w:jc w:val="center"/>
               <w:rPr>
-                <w:rFonts w:ascii="Arial" w:hAnsi="Arial" w:cs="Arial"/>
+                <w:rFonts w:hint="default" w:ascii="Times New Roman" w:hAnsi="Times New Roman" w:cs="Times New Roman"/>
                 <w:color w:val="000000"/>
                 <w:sz w:val="22"/>
                 <w:szCs w:val="22"/>
@@ -3482,7 +3471,7 @@
               <w:spacing w:line="360" w:lineRule="auto"/>
               <w:jc w:val="center"/>
               <w:rPr>
-                <w:rFonts w:ascii="Arial" w:hAnsi="Arial" w:cs="Arial"/>
+                <w:rFonts w:hint="default" w:ascii="Times New Roman" w:hAnsi="Times New Roman" w:cs="Times New Roman"/>
                 <w:color w:val="000000"/>
                 <w:sz w:val="22"/>
                 <w:szCs w:val="22"/>
@@ -3496,7 +3485,7 @@
               <w:spacing w:line="360" w:lineRule="auto"/>
               <w:jc w:val="center"/>
               <w:rPr>
-                <w:rFonts w:ascii="Arial" w:hAnsi="Arial" w:cs="Arial"/>
+                <w:rFonts w:hint="default" w:ascii="Times New Roman" w:hAnsi="Times New Roman" w:cs="Times New Roman"/>
                 <w:color w:val="000000"/>
                 <w:sz w:val="22"/>
                 <w:szCs w:val="22"/>
@@ -3510,22 +3499,22 @@
               <w:spacing w:line="360" w:lineRule="auto"/>
               <w:jc w:val="center"/>
               <w:rPr>
-                <w:rFonts w:ascii="Arial" w:hAnsi="Arial" w:cs="Arial"/>
-                <w:sz w:val="22"/>
-                <w:szCs w:val="22"/>
-                <w:lang w:val="id-ID"/>
-              </w:rPr>
-            </w:pPr>
-            <w:r>
-              <w:rPr>
-                <w:rFonts w:ascii="Arial" w:hAnsi="Arial" w:cs="Arial"/>
+                <w:rFonts w:hint="default" w:ascii="Times New Roman" w:hAnsi="Times New Roman" w:cs="Times New Roman"/>
+                <w:sz w:val="22"/>
+                <w:szCs w:val="22"/>
+                <w:lang w:val="en-US"/>
+              </w:rPr>
+            </w:pPr>
+            <w:r>
+              <w:rPr>
+                <w:rFonts w:hint="default" w:ascii="Times New Roman" w:hAnsi="Times New Roman" w:cs="Times New Roman"/>
                 <w:bCs/>
                 <w:sz w:val="22"/>
                 <w:szCs w:val="22"/>
                 <w:u w:val="single"/>
-                <w:lang w:val="id-ID"/>
-              </w:rPr>
-              <w:t>DANCE ISHAK PALIT, M. Si</w:t>
+                <w:lang w:val="en-US"/>
+              </w:rPr>
+              <w:t>{ketuadprd}</w:t>
             </w:r>
           </w:p>
         </w:tc>
@@ -3539,7 +3528,7 @@
         <w:spacing w:line="360" w:lineRule="auto"/>
         <w:jc w:val="both"/>
         <w:rPr>
-          <w:rFonts w:ascii="Arial" w:hAnsi="Arial" w:cs="Arial"/>
+          <w:rFonts w:hint="default" w:ascii="Times New Roman" w:hAnsi="Times New Roman" w:cs="Times New Roman"/>
           <w:sz w:val="22"/>
           <w:szCs w:val="22"/>
           <w:lang w:val="sv-FI"/>
@@ -3554,7 +3543,7 @@
         <w:spacing w:line="360" w:lineRule="auto"/>
         <w:jc w:val="both"/>
         <w:rPr>
-          <w:rFonts w:ascii="Arial" w:hAnsi="Arial" w:cs="Arial"/>
+          <w:rFonts w:hint="default" w:ascii="Times New Roman" w:hAnsi="Times New Roman" w:cs="Times New Roman"/>
           <w:sz w:val="22"/>
           <w:szCs w:val="22"/>
           <w:lang w:val="sv-FI"/>
@@ -3569,7 +3558,7 @@
         <w:spacing w:line="360" w:lineRule="auto"/>
         <w:jc w:val="both"/>
         <w:rPr>
-          <w:rFonts w:ascii="Arial" w:hAnsi="Arial" w:cs="Arial"/>
+          <w:rFonts w:hint="default" w:ascii="Times New Roman" w:hAnsi="Times New Roman" w:cs="Times New Roman"/>
           <w:sz w:val="22"/>
           <w:szCs w:val="22"/>
           <w:lang w:val="sv-FI"/>
@@ -3584,7 +3573,7 @@
         <w:spacing w:line="360" w:lineRule="auto"/>
         <w:jc w:val="both"/>
         <w:rPr>
-          <w:rFonts w:ascii="Arial" w:hAnsi="Arial" w:cs="Arial"/>
+          <w:rFonts w:hint="default" w:ascii="Times New Roman" w:hAnsi="Times New Roman" w:cs="Times New Roman"/>
           <w:sz w:val="22"/>
           <w:szCs w:val="22"/>
           <w:lang w:val="sv-FI"/>
@@ -3599,7 +3588,7 @@
         <w:spacing w:line="360" w:lineRule="auto"/>
         <w:jc w:val="both"/>
         <w:rPr>
-          <w:rFonts w:ascii="Arial" w:hAnsi="Arial" w:cs="Arial"/>
+          <w:rFonts w:hint="default" w:ascii="Times New Roman" w:hAnsi="Times New Roman" w:cs="Times New Roman"/>
           <w:sz w:val="22"/>
           <w:szCs w:val="22"/>
           <w:lang w:val="sv-FI"/>
@@ -3614,7 +3603,7 @@
         <w:spacing w:line="360" w:lineRule="auto"/>
         <w:jc w:val="both"/>
         <w:rPr>
-          <w:rFonts w:ascii="Arial" w:hAnsi="Arial" w:cs="Arial"/>
+          <w:rFonts w:hint="default" w:ascii="Times New Roman" w:hAnsi="Times New Roman" w:cs="Times New Roman"/>
           <w:sz w:val="22"/>
           <w:szCs w:val="22"/>
           <w:lang w:val="sv-FI"/>
@@ -3629,7 +3618,7 @@
         <w:spacing w:line="360" w:lineRule="auto"/>
         <w:jc w:val="both"/>
         <w:rPr>
-          <w:rFonts w:ascii="Arial" w:hAnsi="Arial" w:cs="Arial"/>
+          <w:rFonts w:hint="default" w:ascii="Times New Roman" w:hAnsi="Times New Roman" w:cs="Times New Roman"/>
           <w:sz w:val="22"/>
           <w:szCs w:val="22"/>
           <w:lang w:val="sv-FI"/>
@@ -3644,7 +3633,7 @@
         <w:spacing w:line="360" w:lineRule="auto"/>
         <w:jc w:val="both"/>
         <w:rPr>
-          <w:rFonts w:ascii="Arial" w:hAnsi="Arial" w:cs="Arial"/>
+          <w:rFonts w:hint="default" w:ascii="Times New Roman" w:hAnsi="Times New Roman" w:cs="Times New Roman"/>
           <w:sz w:val="22"/>
           <w:szCs w:val="22"/>
           <w:lang w:val="id-ID"/>
@@ -3652,7 +3641,7 @@
       </w:pPr>
       <w:r>
         <w:rPr>
-          <w:rFonts w:ascii="Arial" w:hAnsi="Arial" w:cs="Arial"/>
+          <w:rFonts w:hint="default" w:ascii="Times New Roman" w:hAnsi="Times New Roman" w:cs="Times New Roman"/>
           <w:sz w:val="22"/>
           <w:szCs w:val="22"/>
           <w:lang w:val="id-ID"/>
@@ -3665,7 +3654,7 @@
         <w:pStyle w:val="30"/>
         <w:numPr>
           <w:ilvl w:val="0"/>
-          <w:numId w:val="2"/>
+          <w:numId w:val="1"/>
         </w:numPr>
         <w:tabs>
           <w:tab w:val="center" w:pos="7371"/>
@@ -3674,7 +3663,7 @@
         <w:ind w:left="426" w:hanging="284"/>
         <w:jc w:val="both"/>
         <w:rPr>
-          <w:rFonts w:ascii="Arial" w:hAnsi="Arial" w:cs="Arial"/>
+          <w:rFonts w:hint="default" w:ascii="Times New Roman" w:hAnsi="Times New Roman" w:cs="Times New Roman"/>
           <w:sz w:val="22"/>
           <w:szCs w:val="22"/>
           <w:lang w:val="id-ID"/>
@@ -3682,7 +3671,7 @@
       </w:pPr>
       <w:r>
         <w:rPr>
-          <w:rFonts w:ascii="Arial" w:hAnsi="Arial" w:cs="Arial"/>
+          <w:rFonts w:hint="default" w:ascii="Times New Roman" w:hAnsi="Times New Roman" w:cs="Times New Roman"/>
           <w:sz w:val="22"/>
           <w:szCs w:val="22"/>
           <w:lang w:val="id-ID"/>
@@ -3695,7 +3684,7 @@
         <w:pStyle w:val="30"/>
         <w:numPr>
           <w:ilvl w:val="0"/>
-          <w:numId w:val="2"/>
+          <w:numId w:val="1"/>
         </w:numPr>
         <w:tabs>
           <w:tab w:val="center" w:pos="7371"/>
@@ -3712,7 +3701,7 @@
       </w:pPr>
       <w:r>
         <w:rPr>
-          <w:rFonts w:ascii="Arial" w:hAnsi="Arial" w:cs="Arial"/>
+          <w:rFonts w:hint="default" w:ascii="Times New Roman" w:hAnsi="Times New Roman" w:cs="Times New Roman"/>
           <w:sz w:val="22"/>
           <w:szCs w:val="22"/>
           <w:lang w:val="id-ID"/>
@@ -3916,8 +3905,8 @@
       </w:tblPr>
       <w:tblGrid>
         <w:gridCol w:w="1806"/>
-        <w:gridCol w:w="5027"/>
-        <w:gridCol w:w="3657"/>
+        <w:gridCol w:w="5030"/>
+        <w:gridCol w:w="3654"/>
       </w:tblGrid>
       <w:tr>
         <w:tblPrEx>
@@ -3990,7 +3979,7 @@
                 <w:szCs w:val="22"/>
                 <w:lang w:val="en-US"/>
               </w:rPr>
-              <w:t>{nomor_surat}</w:t>
+              <w:t>{nomor_surat_spt}</w:t>
             </w:r>
           </w:p>
         </w:tc>
@@ -4363,7 +4352,7 @@
               <w:pStyle w:val="30"/>
               <w:numPr>
                 <w:ilvl w:val="0"/>
-                <w:numId w:val="3"/>
+                <w:numId w:val="2"/>
               </w:numPr>
               <w:tabs>
                 <w:tab w:val="center" w:pos="7371"/>
@@ -4393,7 +4382,7 @@
               <w:pStyle w:val="30"/>
               <w:numPr>
                 <w:ilvl w:val="0"/>
-                <w:numId w:val="3"/>
+                <w:numId w:val="2"/>
               </w:numPr>
               <w:tabs>
                 <w:tab w:val="center" w:pos="7371"/>
@@ -4441,7 +4430,7 @@
               <w:pStyle w:val="30"/>
               <w:numPr>
                 <w:ilvl w:val="0"/>
-                <w:numId w:val="3"/>
+                <w:numId w:val="2"/>
               </w:numPr>
               <w:tabs>
                 <w:tab w:val="center" w:pos="7371"/>
@@ -5218,19 +5207,38 @@
               <w:jc w:val="center"/>
               <w:rPr>
                 <w:rFonts w:ascii="Arial" w:hAnsi="Arial" w:cs="Arial"/>
-                <w:sz w:val="22"/>
-                <w:szCs w:val="22"/>
-                <w:lang w:val="id-ID"/>
-              </w:rPr>
-            </w:pPr>
-            <w:r>
-              <w:rPr>
-                <w:rFonts w:ascii="Arial" w:hAnsi="Arial" w:cs="Arial"/>
-                <w:sz w:val="22"/>
-                <w:szCs w:val="22"/>
-                <w:lang w:val="id-ID"/>
-              </w:rPr>
-              <w:t>DEWAN PERWAKILAN RAKYAT DAERAH</w:t>
+                <w:color w:val="000000"/>
+                <w:sz w:val="22"/>
+                <w:szCs w:val="22"/>
+                <w:lang w:val="id-ID"/>
+              </w:rPr>
+            </w:pPr>
+            <w:r>
+              <w:rPr>
+                <w:rFonts w:ascii="Arial" w:hAnsi="Arial" w:cs="Arial"/>
+                <w:sz w:val="22"/>
+                <w:szCs w:val="22"/>
+                <w:lang w:val="id-ID"/>
+              </w:rPr>
+              <w:t xml:space="preserve">KOMISI </w:t>
+            </w:r>
+            <w:r>
+              <w:rPr>
+                <w:rFonts w:hint="default" w:ascii="Arial" w:hAnsi="Arial" w:cs="Arial"/>
+                <w:sz w:val="22"/>
+                <w:szCs w:val="22"/>
+                <w:lang w:val="en-US"/>
+              </w:rPr>
+              <w:t>{komisi}</w:t>
+            </w:r>
+            <w:r>
+              <w:rPr>
+                <w:rFonts w:ascii="Arial" w:hAnsi="Arial" w:cs="Arial"/>
+                <w:sz w:val="22"/>
+                <w:szCs w:val="22"/>
+                <w:lang w:val="id-ID"/>
+              </w:rPr>
+              <w:t xml:space="preserve"> DPRD KOTA SALATIGA</w:t>
             </w:r>
           </w:p>
           <w:p>
@@ -5254,7 +5262,7 @@
                 <w:szCs w:val="22"/>
                 <w:lang w:val="id-ID"/>
               </w:rPr>
-              <w:t>KOTA SALATIGA</w:t>
+              <w:t>KETUA</w:t>
             </w:r>
           </w:p>
           <w:p>
@@ -5270,16 +5278,6 @@
                 <w:lang w:val="id-ID"/>
               </w:rPr>
             </w:pPr>
-            <w:r>
-              <w:rPr>
-                <w:rFonts w:ascii="Arial" w:hAnsi="Arial" w:cs="Arial"/>
-                <w:color w:val="000000"/>
-                <w:sz w:val="22"/>
-                <w:szCs w:val="22"/>
-                <w:lang w:val="id-ID"/>
-              </w:rPr>
-              <w:t>KETUA</w:t>
-            </w:r>
           </w:p>
           <w:p>
             <w:pPr>
@@ -5311,41 +5309,46 @@
           </w:p>
           <w:p>
             <w:pPr>
+              <w:pStyle w:val="30"/>
+              <w:numPr>
+                <w:ilvl w:val="0"/>
+                <w:numId w:val="0"/>
+              </w:numPr>
+              <w:tabs>
+                <w:tab w:val="center" w:pos="7371"/>
+              </w:tabs>
+              <w:spacing w:line="360" w:lineRule="auto"/>
+              <w:ind w:left="-10" w:leftChars="0"/>
+              <w:jc w:val="center"/>
+              <w:rPr>
+                <w:rFonts w:hint="default" w:ascii="Arial" w:hAnsi="Arial" w:cs="Arial"/>
+                <w:sz w:val="22"/>
+                <w:szCs w:val="22"/>
+                <w:lang w:val="en-US"/>
+              </w:rPr>
+            </w:pPr>
+            <w:r>
+              <w:rPr>
+                <w:rFonts w:hint="default" w:ascii="Arial" w:hAnsi="Arial" w:cs="Arial"/>
+                <w:sz w:val="22"/>
+                <w:szCs w:val="22"/>
+                <w:lang w:val="en-US"/>
+              </w:rPr>
+              <w:t xml:space="preserve">{nama_ketua_{komisi}} </w:t>
+            </w:r>
+          </w:p>
+          <w:p>
+            <w:pPr>
               <w:adjustRightInd w:val="0"/>
               <w:spacing w:line="360" w:lineRule="auto"/>
               <w:jc w:val="center"/>
               <w:rPr>
                 <w:rFonts w:ascii="Arial" w:hAnsi="Arial" w:cs="Arial"/>
-                <w:color w:val="000000"/>
-                <w:sz w:val="22"/>
-                <w:szCs w:val="22"/>
-                <w:lang w:val="id-ID"/>
-              </w:rPr>
-            </w:pPr>
-          </w:p>
-          <w:p>
-            <w:pPr>
-              <w:adjustRightInd w:val="0"/>
-              <w:spacing w:line="360" w:lineRule="auto"/>
-              <w:jc w:val="center"/>
-              <w:rPr>
-                <w:rFonts w:ascii="Arial" w:hAnsi="Arial" w:cs="Arial"/>
-                <w:sz w:val="22"/>
-                <w:szCs w:val="22"/>
-                <w:lang w:val="id-ID"/>
-              </w:rPr>
-            </w:pPr>
-            <w:r>
-              <w:rPr>
-                <w:rFonts w:ascii="Arial" w:hAnsi="Arial" w:cs="Arial"/>
-                <w:bCs/>
-                <w:sz w:val="22"/>
-                <w:szCs w:val="22"/>
-                <w:u w:val="single"/>
-                <w:lang w:val="id-ID"/>
-              </w:rPr>
-              <w:t>DANCE ISHAK PALIT, M. Si</w:t>
-            </w:r>
+                <w:sz w:val="22"/>
+                <w:szCs w:val="22"/>
+                <w:lang w:val="id-ID"/>
+              </w:rPr>
+            </w:pPr>
           </w:p>
         </w:tc>
       </w:tr>
@@ -5484,7 +5487,7 @@
         <w:pStyle w:val="30"/>
         <w:numPr>
           <w:ilvl w:val="0"/>
-          <w:numId w:val="4"/>
+          <w:numId w:val="3"/>
         </w:numPr>
         <w:tabs>
           <w:tab w:val="center" w:pos="7371"/>
@@ -5513,7 +5516,7 @@
         <w:pStyle w:val="30"/>
         <w:numPr>
           <w:ilvl w:val="0"/>
-          <w:numId w:val="4"/>
+          <w:numId w:val="3"/>
         </w:numPr>
         <w:tabs>
           <w:tab w:val="center" w:pos="7371"/>
@@ -5900,7 +5903,7 @@
                 <w:szCs w:val="22"/>
                 <w:lang w:val="en-US"/>
               </w:rPr>
-              <w:t>{nomor_surat}</w:t>
+              <w:t>{nomor_surat_spt}</w:t>
             </w:r>
           </w:p>
         </w:tc>
@@ -6142,6 +6145,7 @@
       <w:pPr>
         <w:pStyle w:val="30"/>
         <w:numPr>
+          <w:ilvl w:val="0"/>
           <w:numId w:val="0"/>
         </w:numPr>
         <w:tabs>
@@ -6150,12 +6154,10 @@
         <w:spacing w:line="360" w:lineRule="auto"/>
         <w:ind w:left="-10" w:leftChars="0"/>
         <w:rPr>
-          <w:rFonts w:ascii="Arial" w:hAnsi="Arial" w:cs="Arial"/>
-          <w:b/>
-          <w:sz w:val="22"/>
-          <w:szCs w:val="22"/>
-          <w:u w:val="single"/>
-          <w:lang w:val="id-ID"/>
+          <w:rFonts w:hint="default" w:ascii="Arial" w:hAnsi="Arial" w:cs="Arial"/>
+          <w:sz w:val="22"/>
+          <w:szCs w:val="22"/>
+          <w:lang w:val="en-US"/>
         </w:rPr>
       </w:pPr>
       <w:r>
@@ -6170,7 +6172,37 @@
     </w:p>
     <w:p>
       <w:pPr>
+        <w:pStyle w:val="30"/>
         <w:numPr>
+          <w:ilvl w:val="0"/>
+          <w:numId w:val="0"/>
+        </w:numPr>
+        <w:tabs>
+          <w:tab w:val="center" w:pos="7371"/>
+        </w:tabs>
+        <w:spacing w:line="360" w:lineRule="auto"/>
+        <w:ind w:left="-10" w:leftChars="0"/>
+        <w:rPr>
+          <w:rFonts w:hint="default" w:ascii="Arial" w:hAnsi="Arial" w:cs="Arial"/>
+          <w:sz w:val="22"/>
+          <w:szCs w:val="22"/>
+          <w:lang w:val="id-ID"/>
+        </w:rPr>
+      </w:pPr>
+      <w:r>
+        <w:rPr>
+          <w:rFonts w:hint="default" w:ascii="Arial" w:hAnsi="Arial" w:cs="Arial"/>
+          <w:sz w:val="22"/>
+          <w:szCs w:val="22"/>
+          <w:lang w:val="id-ID"/>
+        </w:rPr>
+        <w:t>{pendamping_block}</w:t>
+      </w:r>
+    </w:p>
+    <w:p>
+      <w:pPr>
+        <w:numPr>
+          <w:ilvl w:val="0"/>
           <w:numId w:val="0"/>
         </w:numPr>
         <w:tabs>
@@ -6417,32 +6449,6 @@
           </w:p>
           <w:p>
             <w:pPr>
-              <w:tabs>
-                <w:tab w:val="center" w:pos="7371"/>
-              </w:tabs>
-              <w:jc w:val="center"/>
-              <w:rPr>
-                <w:rFonts w:ascii="Arial" w:hAnsi="Arial" w:cs="Arial"/>
-                <w:b/>
-                <w:sz w:val="22"/>
-                <w:szCs w:val="22"/>
-                <w:u w:val="single"/>
-                <w:lang w:val="id-ID"/>
-              </w:rPr>
-            </w:pPr>
-            <w:r>
-              <w:rPr>
-                <w:rFonts w:hint="default" w:ascii="Arial" w:hAnsi="Arial" w:cs="Arial"/>
-                <w:bCs/>
-                <w:sz w:val="22"/>
-                <w:szCs w:val="22"/>
-                <w:lang w:val="en-US"/>
-              </w:rPr>
-              <w:t>KETUA KOMISI {komisi}</w:t>
-            </w:r>
-          </w:p>
-          <w:p>
-            <w:pPr>
               <w:pStyle w:val="30"/>
               <w:numPr>
                 <w:ilvl w:val="0"/>
@@ -6536,119 +6542,6 @@
 <file path=word/numbering.xml><?xml version="1.0" encoding="utf-8"?>
 <w:numbering xmlns:wpc="http://schemas.microsoft.com/office/word/2010/wordprocessingCanvas" xmlns:mc="http://schemas.openxmlformats.org/markup-compatibility/2006" xmlns:o="urn:schemas-microsoft-com:office:office" xmlns:r="http://schemas.openxmlformats.org/officeDocument/2006/relationships" xmlns:m="http://schemas.openxmlformats.org/officeDocument/2006/math" xmlns:v="urn:schemas-microsoft-com:vml" xmlns:wp14="http://schemas.microsoft.com/office/word/2010/wordprocessingDrawing" xmlns:wp="http://schemas.openxmlformats.org/drawingml/2006/wordprocessingDrawing" xmlns:w10="urn:schemas-microsoft-com:office:word" xmlns:w="http://schemas.openxmlformats.org/wordprocessingml/2006/main" xmlns:w14="http://schemas.microsoft.com/office/word/2010/wordml" xmlns:wpg="http://schemas.microsoft.com/office/word/2010/wordprocessingGroup" xmlns:wpi="http://schemas.microsoft.com/office/word/2010/wordprocessingInk" xmlns:wne="http://schemas.microsoft.com/office/word/2006/wordml" xmlns:wps="http://schemas.microsoft.com/office/word/2010/wordprocessingShape" xmlns:wpsCustomData="http://www.wps.cn/officeDocument/2013/wpsCustomData" mc:Ignorable="w14 wp14">
   <w:abstractNum w:abstractNumId="0">
-    <w:nsid w:val="01043295"/>
-    <w:multiLevelType w:val="multilevel"/>
-    <w:tmpl w:val="01043295"/>
-    <w:lvl w:ilvl="0" w:tentative="0">
-      <w:start w:val="27"/>
-      <w:numFmt w:val="bullet"/>
-      <w:lvlText w:val="-"/>
-      <w:lvlJc w:val="left"/>
-      <w:pPr>
-        <w:ind w:left="720" w:hanging="360"/>
-      </w:pPr>
-      <w:rPr>
-        <w:rFonts w:hint="default" w:ascii="Arial" w:hAnsi="Arial" w:eastAsia="Times New Roman" w:cs="Arial"/>
-      </w:rPr>
-    </w:lvl>
-    <w:lvl w:ilvl="1" w:tentative="0">
-      <w:start w:val="1"/>
-      <w:numFmt w:val="bullet"/>
-      <w:lvlText w:val="o"/>
-      <w:lvlJc w:val="left"/>
-      <w:pPr>
-        <w:ind w:left="1440" w:hanging="360"/>
-      </w:pPr>
-      <w:rPr>
-        <w:rFonts w:hint="default" w:ascii="Courier New" w:hAnsi="Courier New" w:cs="Courier New"/>
-      </w:rPr>
-    </w:lvl>
-    <w:lvl w:ilvl="2" w:tentative="0">
-      <w:start w:val="1"/>
-      <w:numFmt w:val="bullet"/>
-      <w:lvlText w:val=""/>
-      <w:lvlJc w:val="left"/>
-      <w:pPr>
-        <w:ind w:left="2160" w:hanging="360"/>
-      </w:pPr>
-      <w:rPr>
-        <w:rFonts w:hint="default" w:ascii="Wingdings" w:hAnsi="Wingdings"/>
-      </w:rPr>
-    </w:lvl>
-    <w:lvl w:ilvl="3" w:tentative="0">
-      <w:start w:val="1"/>
-      <w:numFmt w:val="bullet"/>
-      <w:lvlText w:val=""/>
-      <w:lvlJc w:val="left"/>
-      <w:pPr>
-        <w:ind w:left="2880" w:hanging="360"/>
-      </w:pPr>
-      <w:rPr>
-        <w:rFonts w:hint="default" w:ascii="Symbol" w:hAnsi="Symbol"/>
-      </w:rPr>
-    </w:lvl>
-    <w:lvl w:ilvl="4" w:tentative="0">
-      <w:start w:val="1"/>
-      <w:numFmt w:val="bullet"/>
-      <w:lvlText w:val="o"/>
-      <w:lvlJc w:val="left"/>
-      <w:pPr>
-        <w:ind w:left="3600" w:hanging="360"/>
-      </w:pPr>
-      <w:rPr>
-        <w:rFonts w:hint="default" w:ascii="Courier New" w:hAnsi="Courier New" w:cs="Courier New"/>
-      </w:rPr>
-    </w:lvl>
-    <w:lvl w:ilvl="5" w:tentative="0">
-      <w:start w:val="1"/>
-      <w:numFmt w:val="bullet"/>
-      <w:lvlText w:val=""/>
-      <w:lvlJc w:val="left"/>
-      <w:pPr>
-        <w:ind w:left="4320" w:hanging="360"/>
-      </w:pPr>
-      <w:rPr>
-        <w:rFonts w:hint="default" w:ascii="Wingdings" w:hAnsi="Wingdings"/>
-      </w:rPr>
-    </w:lvl>
-    <w:lvl w:ilvl="6" w:tentative="0">
-      <w:start w:val="1"/>
-      <w:numFmt w:val="bullet"/>
-      <w:lvlText w:val=""/>
-      <w:lvlJc w:val="left"/>
-      <w:pPr>
-        <w:ind w:left="5040" w:hanging="360"/>
-      </w:pPr>
-      <w:rPr>
-        <w:rFonts w:hint="default" w:ascii="Symbol" w:hAnsi="Symbol"/>
-      </w:rPr>
-    </w:lvl>
-    <w:lvl w:ilvl="7" w:tentative="0">
-      <w:start w:val="1"/>
-      <w:numFmt w:val="bullet"/>
-      <w:lvlText w:val="o"/>
-      <w:lvlJc w:val="left"/>
-      <w:pPr>
-        <w:ind w:left="5760" w:hanging="360"/>
-      </w:pPr>
-      <w:rPr>
-        <w:rFonts w:hint="default" w:ascii="Courier New" w:hAnsi="Courier New" w:cs="Courier New"/>
-      </w:rPr>
-    </w:lvl>
-    <w:lvl w:ilvl="8" w:tentative="0">
-      <w:start w:val="1"/>
-      <w:numFmt w:val="bullet"/>
-      <w:lvlText w:val=""/>
-      <w:lvlJc w:val="left"/>
-      <w:pPr>
-        <w:ind w:left="6480" w:hanging="360"/>
-      </w:pPr>
-      <w:rPr>
-        <w:rFonts w:hint="default" w:ascii="Wingdings" w:hAnsi="Wingdings"/>
-      </w:rPr>
-    </w:lvl>
-  </w:abstractNum>
-  <w:abstractNum w:abstractNumId="1">
     <w:nsid w:val="13653CD0"/>
     <w:multiLevelType w:val="multilevel"/>
     <w:tmpl w:val="13653CD0"/>
@@ -6737,7 +6630,7 @@
       </w:pPr>
     </w:lvl>
   </w:abstractNum>
-  <w:abstractNum w:abstractNumId="2">
+  <w:abstractNum w:abstractNumId="1">
     <w:nsid w:val="3FB82D77"/>
     <w:multiLevelType w:val="multilevel"/>
     <w:tmpl w:val="3FB82D77"/>
@@ -6826,7 +6719,7 @@
       </w:pPr>
     </w:lvl>
   </w:abstractNum>
-  <w:abstractNum w:abstractNumId="3">
+  <w:abstractNum w:abstractNumId="2">
     <w:nsid w:val="45C97A04"/>
     <w:multiLevelType w:val="multilevel"/>
     <w:tmpl w:val="45C97A04"/>
@@ -6916,16 +6809,13 @@
     </w:lvl>
   </w:abstractNum>
   <w:num w:numId="1">
+    <w:abstractNumId w:val="1"/>
+  </w:num>
+  <w:num w:numId="2">
     <w:abstractNumId w:val="0"/>
   </w:num>
-  <w:num w:numId="2">
+  <w:num w:numId="3">
     <w:abstractNumId w:val="2"/>
-  </w:num>
-  <w:num w:numId="3">
-    <w:abstractNumId w:val="1"/>
-  </w:num>
-  <w:num w:numId="4">
-    <w:abstractNumId w:val="3"/>
   </w:num>
 </w:numbering>
 </file>

</xml_diff>